<commit_message>
docs(diagram): them anh va vector so do kien truc container Hinh 1 va nhung vao bao cao Word
</commit_message>
<xml_diff>
--- a/docs/HUONG_DAN_SU_DUNG_VA_KIEM_THU.docx
+++ b/docs/HUONG_DAN_SU_DUNG_VA_KIEM_THU.docx
@@ -353,6 +353,78 @@
       <w:r>
         <w:t>• Lấy Auth Token qua API:</w:t>
         <w:br/>
+      </w:r>
+    </w:p>
+    <w:p>
+      <w:pPr>
+        <w:pStyle w:val="Heading2"/>
+      </w:pPr>
+      <w:r>
+        <w:rPr>
+          <w:rFonts w:ascii="Times New Roman" w:hAnsi="Times New Roman"/>
+        </w:rPr>
+        <w:t>1.3. Sơ đồ kiến trúc container hệ thống Paperless-ngx (Hình 1)</w:t>
+      </w:r>
+    </w:p>
+    <w:p>
+      <w:r>
+        <w:rPr>
+          <w:rFonts w:ascii="Times New Roman" w:hAnsi="Times New Roman"/>
+        </w:rPr>
+        <w:t>Dưới đây là sơ đồ chi tiết kiến trúc các container trong môi trường Docker Compose (gồm 3 services: webserver, database postgres, và message broker redis) cùng các phân vùng lưu trữ persistent volumes:</w:t>
+        <w:br/>
+      </w:r>
+    </w:p>
+    <w:p>
+      <w:pPr>
+        <w:jc w:val="center"/>
+      </w:pPr>
+      <w:r>
+        <w:drawing>
+          <wp:inline xmlns:a="http://schemas.openxmlformats.org/drawingml/2006/main" xmlns:pic="http://schemas.openxmlformats.org/drawingml/2006/picture">
+            <wp:extent cx="5943600" cy="3714750"/>
+            <wp:docPr id="1" name="Picture 1"/>
+            <wp:cNvGraphicFramePr>
+              <a:graphicFrameLocks noChangeAspect="1"/>
+            </wp:cNvGraphicFramePr>
+            <a:graphic>
+              <a:graphicData uri="http://schemas.openxmlformats.org/drawingml/2006/picture">
+                <pic:pic>
+                  <pic:nvPicPr>
+                    <pic:cNvPr id="0" name="so_do_kien_truc_container.png"/>
+                    <pic:cNvPicPr/>
+                  </pic:nvPicPr>
+                  <pic:blipFill>
+                    <a:blip r:embed="rId9"/>
+                    <a:stretch>
+                      <a:fillRect/>
+                    </a:stretch>
+                  </pic:blipFill>
+                  <pic:spPr>
+                    <a:xfrm>
+                      <a:off x="0" y="0"/>
+                      <a:ext cx="5943600" cy="3714750"/>
+                    </a:xfrm>
+                    <a:prstGeom prst="rect"/>
+                  </pic:spPr>
+                </pic:pic>
+              </a:graphicData>
+            </a:graphic>
+          </wp:inline>
+        </w:drawing>
+      </w:r>
+    </w:p>
+    <w:p>
+      <w:pPr>
+        <w:jc w:val="center"/>
+      </w:pPr>
+      <w:r>
+        <w:rPr>
+          <w:rFonts w:ascii="Times New Roman" w:hAnsi="Times New Roman"/>
+          <w:i/>
+          <w:sz w:val="20"/>
+        </w:rPr>
+        <w:t>Hình 1: Sơ đồ kiến trúc container hệ thống Paperless-ngx v3.1.3</w:t>
       </w:r>
     </w:p>
     <w:p>

</xml_diff>

<commit_message>
docs(erd): them anh va vector so do quan he du lieu Hinh 2 va cap nhat file Word
</commit_message>
<xml_diff>
--- a/docs/HUONG_DAN_SU_DUNG_VA_KIEM_THU.docx
+++ b/docs/HUONG_DAN_SU_DUNG_VA_KIEM_THU.docx
@@ -425,6 +425,78 @@
           <w:sz w:val="20"/>
         </w:rPr>
         <w:t>Hình 1: Sơ đồ kiến trúc container hệ thống Paperless-ngx v3.1.3</w:t>
+      </w:r>
+    </w:p>
+    <w:p>
+      <w:pPr>
+        <w:pStyle w:val="Heading2"/>
+      </w:pPr>
+      <w:r>
+        <w:rPr>
+          <w:rFonts w:ascii="Times New Roman" w:hAnsi="Times New Roman"/>
+        </w:rPr>
+        <w:t>1.4. Sơ đồ quan hệ dữ liệu cốt lõi (Hình 2 - ER Diagram)</w:t>
+      </w:r>
+    </w:p>
+    <w:p>
+      <w:r>
+        <w:rPr>
+          <w:rFonts w:ascii="Times New Roman" w:hAnsi="Times New Roman"/>
+        </w:rPr>
+        <w:t>Dưới đây là sơ đồ quan hệ thực thể (ERD) giữa 4 tài nguyên trọng tâm (Document, Tag, Correspondent, DocumentType) và bảng người dùng User được trích xuất trực tiếp từ models.py:</w:t>
+        <w:br/>
+      </w:r>
+    </w:p>
+    <w:p>
+      <w:pPr>
+        <w:jc w:val="center"/>
+      </w:pPr>
+      <w:r>
+        <w:drawing>
+          <wp:inline xmlns:a="http://schemas.openxmlformats.org/drawingml/2006/main" xmlns:pic="http://schemas.openxmlformats.org/drawingml/2006/picture">
+            <wp:extent cx="5943600" cy="3900488"/>
+            <wp:docPr id="2" name="Picture 2"/>
+            <wp:cNvGraphicFramePr>
+              <a:graphicFrameLocks noChangeAspect="1"/>
+            </wp:cNvGraphicFramePr>
+            <a:graphic>
+              <a:graphicData uri="http://schemas.openxmlformats.org/drawingml/2006/picture">
+                <pic:pic>
+                  <pic:nvPicPr>
+                    <pic:cNvPr id="0" name="so_do_quan_he_du_lieu.png"/>
+                    <pic:cNvPicPr/>
+                  </pic:nvPicPr>
+                  <pic:blipFill>
+                    <a:blip r:embed="rId10"/>
+                    <a:stretch>
+                      <a:fillRect/>
+                    </a:stretch>
+                  </pic:blipFill>
+                  <pic:spPr>
+                    <a:xfrm>
+                      <a:off x="0" y="0"/>
+                      <a:ext cx="5943600" cy="3900488"/>
+                    </a:xfrm>
+                    <a:prstGeom prst="rect"/>
+                  </pic:spPr>
+                </pic:pic>
+              </a:graphicData>
+            </a:graphic>
+          </wp:inline>
+        </w:drawing>
+      </w:r>
+    </w:p>
+    <w:p>
+      <w:pPr>
+        <w:jc w:val="center"/>
+      </w:pPr>
+      <w:r>
+        <w:rPr>
+          <w:rFonts w:ascii="Times New Roman" w:hAnsi="Times New Roman"/>
+          <w:i/>
+          <w:sz w:val="20"/>
+        </w:rPr>
+        <w:t>Hình 2: Sơ đồ quan hệ dữ liệu (ER Diagram) giữa các thực thể trong Paperless-ngx</w:t>
       </w:r>
     </w:p>
     <w:p>

</xml_diff>